<commit_message>
Fase verifikasi final: tutup ruang kosong halaman di 3 modul dgn residual gap terbesar
Menambahkan paragraf penjelasan substantif (bukan mengecilkan gambar,
konsisten dengan lesson learned dari batch Opto) tepat sebelum
blok gambar/tabel yang diketahui lompat halaman:

- Getaran Modul 3 (Getaran Bebas Teredam): 8.6cm -> 0cm
- Getaran Modul 12 (Indikator Time-Domain): 7.4cm -> 0cm
- Math4 Modul 10 (Transformasi Laplace): 20.7cm -> 4.9cm

Hasil akhir seluruh 28 modul (14 Getaran + 14 Math4): 24/28 modul 0 gap
sama sekali, sisa 4 modul (Math4-6, Math4-10, Math4-12, Getaran-14)
punya residual kecil 3.5-4.9cm yang diterima sebagai variasi wajar
(total residual seluruh 28 modul cuma 20.5cm, jauh di bawah threshold
yang pernah dianggap perlu perbaikan lanjutan pada batch Opto).

Co-Authored-By: Claude Sonnet 5 <noreply@anthropic.com>
Claude-Session: https://claude.ai/code/session_01MRPE2Wfn5ruEpMsNER92uG
</commit_message>
<xml_diff>
--- a/Engineering-Mathematics/Modul-Word/Modul-10-Transformasi-Laplace.docx
+++ b/Engineering-Mathematics/Modul-Word/Modul-10-Transformasi-Laplace.docx
@@ -6906,6 +6906,30 @@
     </w:p>
     <w:p>
       <w:pPr>
+        <w:spacing w:line="360" w:lineRule="auto" w:after="120"/>
+        <w:jc w:val="both"/>
+      </w:pPr>
+      <w:r>
+        <w:rPr>
+          <w:rFonts w:ascii="Arial" w:hAnsi="Arial" w:cs="Arial"/>
+          <w:b/>
+          <w:i w:val="0"/>
+          <w:sz w:val="22"/>
+        </w:rPr>
+        <w:t xml:space="preserve">Mengapa Satu Studi Kasus Cukup Mewakili Lima Bidang: </w:t>
+      </w:r>
+      <w:r>
+        <w:rPr>
+          <w:rFonts w:ascii="Arial" w:hAnsi="Arial" w:cs="Arial"/>
+          <w:b w:val="0"/>
+          <w:i w:val="0"/>
+          <w:sz w:val="22"/>
+        </w:rPr>
+        <w:t>Pemilihan sirkuit RLC seri sebagai studi kasus tunggal (bukan lima studi kasus terpisah untuk lima bidang aplikasi) adalah keputusan pedagogis yang disengaja: struktur PD orde dua L*q''+R*q'+(1/C)*q=V0*u(t) secara matematis identik dengan PD sistem massa-pegas-peredam m*x''+c*x'+k*x=F(t) pada bidang mekanik (dengan padanan L-m, R-c, 1/C-k), dan juga identik dengan struktur transfer function orde dua yang dipakai insinyur kendali untuk desain kompensator PID. Mahasiswa yang menguasai penyelesaian lengkap sirkuit RLC ini dapat langsung memetakan setiap langkah ke keempat bidang aplikasi lainnya hanya dengan mengganti nama variabel dan interpretasi fisisnya, tanpa perlu mempelajari prosedur baru dari awal.</w:t>
+      </w:r>
+    </w:p>
+    <w:p>
+      <w:pPr>
         <w:keepNext/>
         <w:spacing w:before="120" w:after="40"/>
         <w:jc w:val="center"/>
@@ -7394,6 +7418,30 @@
           <w:sz w:val="22"/>
         </w:rPr>
         <w:t>Perhatikan bahwa parameter sistem pada Cell 4, yaitu H(s)=1/(s^2+4s+13) dengan pole s=-2 plus minus 3j, sengaja dipilih identik dengan denominator studi kasus sirkuit RLC pada bagian Aplikasi Industri, sehingga hasil Cell 4 dapat langsung dijadikan pembanding numerik terhadap penurunan manual q(t) pada studi kasus tersebut. Kesamaan pole ini bukan kebetulan, melainkan strategi pedagogis yang sengaja diulang di modul ini, sebab mahasiswa akan lebih mudah menghubungkan rumus abstrak time constant tau=1/sigma, damped frequency omega_d, dan settling time 3/sigma dengan angka konkret yang sudah pernah dihitung tangan sebelumnya, alih-alih dihadapkan pada contoh baru yang tidak berkaitan. Kebiasaan menyusun satu contoh numerik yang dipakai berulang lintas bagian modul, mulai dari penurunan manual, verifikasi SymPy, hingga visualisasi grafis, adalah praktik baik yang juga disarankan saat mahasiswa mengerjakan Tugas Pertemuan 11, khususnya soal Komputasi Hard yang menuntut solver generik diuji pada parameter studi kasus yang sama persis dengan modul.</w:t>
+      </w:r>
+    </w:p>
+    <w:p>
+      <w:pPr>
+        <w:spacing w:line="360" w:lineRule="auto" w:after="120"/>
+        <w:jc w:val="both"/>
+      </w:pPr>
+      <w:r>
+        <w:rPr>
+          <w:rFonts w:ascii="Arial" w:hAnsi="Arial" w:cs="Arial"/>
+          <w:b/>
+          <w:i w:val="0"/>
+          <w:sz w:val="22"/>
+        </w:rPr>
+        <w:t xml:space="preserve">Hubungan Step Response dan Impulse Response: </w:t>
+      </w:r>
+      <w:r>
+        <w:rPr>
+          <w:rFonts w:ascii="Arial" w:hAnsi="Arial" w:cs="Arial"/>
+          <w:b w:val="0"/>
+          <w:i w:val="0"/>
+          <w:sz w:val="22"/>
+        </w:rPr>
+        <w:t>Perbandingan step response dan impulse response pada Gambar 8 juga menegaskan satu prinsip fundamental sistem linier time-invariant (LTI): impulse response h(t) adalah turunan step response, dan sebaliknya step response adalah integral impulse response, hubungan yang berlaku persis karena delta(t) adalah turunan formal dari u(t). Insinyur kendali memanfaatkan hubungan ini secara praktis: impulse response (lebih mudah diukur lewat uji impact hammer singkat pada struktur mekanik) dapat langsung diintegralkan secara numerik untuk memperkirakan step response tanpa perlu menunggu eksperimen step-input yang memakan waktu lebih lama, terutama berguna untuk sistem berskala besar seperti gedung atau jembatan yang sulit diberi input step murni secara fisik.</w:t>
       </w:r>
     </w:p>
     <w:p>

</xml_diff>